<commit_message>
Spatial: cell-type branch inside the pipelines, reference optional
labelTransfer 1.2, rctd 1.2, hd_rctd 1.2: an empty reference_rds writes
output_dir/skipped.txt and ends with exit 0, so the pipelines run without
a reference. With a reference, an empty or unknown reference_label_col
stops right after the reference is read and lists the cell-type column
candidates (categorical, 2-100 categories) with their first categories.

condition_de 1.4: an input_dir with skipped.txt is skipped the same way.

Docs: both pipelines list the cell-type modules and the optional
reference inputs; maps draw the cell-type branch; key notes and module
notes explain the skip and the column check; Word files regenerated.

Co-Authored-By: Claude Opus 5.5 <noreply@anthropic.com>
</commit_message>
<xml_diff>
--- a/docs/Spatial_Transcriptomics_Analysis_Pipeline/pipeline/Portal_Content.docx
+++ b/docs/Spatial_Transcriptomics_Analysis_Pipeline/pipeline/Portal_Content.docx
@@ -299,7 +299,7 @@
                 <w:sz w:val="18"/>
                 <w:szCs w:val="18"/>
               </w:rPr>
-              <w:t xml:space="preserve">spatial_prep, spatial_cluster, spatial_svf, spatial_merge, spatial_condition_de</w:t>
+              <w:t xml:space="preserve">spatial_prep, spatial_cluster, spatial_svf, spatial_merge, spatial_condition_de, spatial_labelTransfer, spatial_rctd (세포 유형 2개는 참조를 줄 때 실행)</w:t>
             </w:r>
           </w:p>
         </w:tc>
@@ -321,7 +321,7 @@
                 <w:sz w:val="18"/>
                 <w:szCs w:val="18"/>
               </w:rPr>
-              <w:t xml:space="preserve">Version</w:t>
+              <w:t xml:space="preserve">파이프라인 입력</w:t>
             </w:r>
           </w:p>
         </w:tc>
@@ -341,7 +341,35 @@
                 <w:sz w:val="18"/>
                 <w:szCs w:val="18"/>
               </w:rPr>
-              <w:t xml:space="preserve">1.1 (CLOSHA 2.0 파이프라인 버전 + 1. 등록 메모: 2.0 파이프라인 버전이 1.0이라는 전제이며, 다르면 그 번호 + 1로 고칩니다)</w:t>
+              <w:t xml:space="preserve">Space Ranger 슬라이스 폴더(필수), 슬라이스 정보 CSV(필수), 단일세포 참조 RDS </w:t>
+            </w:r>
+            <w:r>
+              <w:rPr>
+                <w:sz w:val="18"/>
+                <w:szCs w:val="18"/>
+              </w:rPr>
+              <w:t xml:space="preserve">reference_rds</w:t>
+            </w:r>
+            <w:r>
+              <w:rPr>
+                <w:sz w:val="18"/>
+                <w:szCs w:val="18"/>
+              </w:rPr>
+              <w:t xml:space="preserve">와 세포 유형 열 </w:t>
+            </w:r>
+            <w:r>
+              <w:rPr>
+                <w:sz w:val="18"/>
+                <w:szCs w:val="18"/>
+              </w:rPr>
+              <w:t xml:space="preserve">reference_label_col</w:t>
+            </w:r>
+            <w:r>
+              <w:rPr>
+                <w:sz w:val="18"/>
+                <w:szCs w:val="18"/>
+              </w:rPr>
+              <w:t xml:space="preserve">(선택)</w:t>
             </w:r>
           </w:p>
         </w:tc>
@@ -363,7 +391,7 @@
                 <w:sz w:val="18"/>
                 <w:szCs w:val="18"/>
               </w:rPr>
-              <w:t xml:space="preserve">Reference</w:t>
+              <w:t xml:space="preserve">Version</w:t>
             </w:r>
           </w:p>
         </w:tc>
@@ -383,7 +411,7 @@
                 <w:sz w:val="18"/>
                 <w:szCs w:val="18"/>
               </w:rPr>
-              <w:t xml:space="preserve">https://satijalab.org/seurat/articles/spatial_vignette</w:t>
+              <w:t xml:space="preserve">1.1 (CLOSHA 2.0 파이프라인 버전 + 1. 등록 메모: 2.0 파이프라인 버전이 1.0이라는 전제이며, 다르면 그 번호 + 1로 고칩니다)</w:t>
             </w:r>
           </w:p>
         </w:tc>
@@ -405,7 +433,7 @@
                 <w:sz w:val="18"/>
                 <w:szCs w:val="18"/>
               </w:rPr>
-              <w:t xml:space="preserve">Keyword(태그)</w:t>
+              <w:t xml:space="preserve">Reference</w:t>
             </w:r>
           </w:p>
         </w:tc>
@@ -425,7 +453,7 @@
                 <w:sz w:val="18"/>
                 <w:szCs w:val="18"/>
               </w:rPr>
-              <w:t xml:space="preserve">spatial transcriptomics, Visium, clustering, spatially variable genes, multi-slice integration, differential expression</w:t>
+              <w:t xml:space="preserve">https://satijalab.org/seurat/articles/spatial_vignette</w:t>
             </w:r>
           </w:p>
         </w:tc>
@@ -447,7 +475,7 @@
                 <w:sz w:val="18"/>
                 <w:szCs w:val="18"/>
               </w:rPr>
-              <w:t xml:space="preserve">대분류 / 중분류</w:t>
+              <w:t xml:space="preserve">Keyword(태그)</w:t>
             </w:r>
           </w:p>
         </w:tc>
@@ -467,7 +495,7 @@
                 <w:sz w:val="18"/>
                 <w:szCs w:val="18"/>
               </w:rPr>
-              <w:t xml:space="preserve">등록 메모: 포탈 파이프라인 목록에서 가장 가까운 것을 고릅니다(후보: Transcriptomics / Spatial transcriptomics).</w:t>
+              <w:t xml:space="preserve">spatial transcriptomics, Visium, clustering, spatially variable genes, multi-slice integration, differential expression</w:t>
             </w:r>
           </w:p>
         </w:tc>
@@ -489,7 +517,7 @@
                 <w:sz w:val="18"/>
                 <w:szCs w:val="18"/>
               </w:rPr>
-              <w:t xml:space="preserve">대표 이미지</w:t>
+              <w:t xml:space="preserve">대분류 / 중분류</w:t>
             </w:r>
           </w:p>
         </w:tc>
@@ -509,6 +537,48 @@
                 <w:sz w:val="18"/>
                 <w:szCs w:val="18"/>
               </w:rPr>
+              <w:t xml:space="preserve">등록 메모: 포탈 파이프라인 목록에서 가장 가까운 것을 고릅니다(후보: Transcriptomics / Spatial transcriptomics).</w:t>
+            </w:r>
+          </w:p>
+        </w:tc>
+      </w:tr>
+      <w:tr>
+        <w:tc>
+          <w:tcPr>
+            <w:tcW w:type="dxa" w:w="4753"/>
+            <w:tcMar>
+              <w:top w:type="dxa" w:w="60"/>
+              <w:left w:type="dxa" w:w="90"/>
+              <w:bottom w:type="dxa" w:w="60"/>
+              <w:right w:type="dxa" w:w="90"/>
+            </w:tcMar>
+          </w:tcPr>
+          <w:p>
+            <w:r>
+              <w:rPr>
+                <w:sz w:val="18"/>
+                <w:szCs w:val="18"/>
+              </w:rPr>
+              <w:t xml:space="preserve">대표 이미지</w:t>
+            </w:r>
+          </w:p>
+        </w:tc>
+        <w:tc>
+          <w:tcPr>
+            <w:tcW w:type="dxa" w:w="4753"/>
+            <w:tcMar>
+              <w:top w:type="dxa" w:w="60"/>
+              <w:left w:type="dxa" w:w="90"/>
+              <w:bottom w:type="dxa" w:w="60"/>
+              <w:right w:type="dxa" w:w="90"/>
+            </w:tcMar>
+          </w:tcPr>
+          <w:p>
+            <w:r>
+              <w:rPr>
+                <w:sz w:val="18"/>
+                <w:szCs w:val="18"/>
+              </w:rPr>
               <w:t xml:space="preserve">등록 메모: 결과 그림을 본 뒤 고릅니다(후보: spatial_merge 조직 위 통합 군집).</w:t>
             </w:r>
           </w:p>
@@ -896,7 +966,7 @@
       <w:r>
         <w:drawing>
           <wp:inline distT="0" distB="0" distL="0" distR="0">
-            <wp:extent cx="5715000" cy="3429000"/>
+            <wp:extent cx="5715000" cy="4638675"/>
             <wp:effectExtent t="0" r="0" b="0" l="0"/>
             <wp:docPr id="1" name="" descr="" title=""/>
             <wp:cNvGraphicFramePr>
@@ -921,7 +991,7 @@
                   <pic:spPr bwMode="auto">
                     <a:xfrm>
                       <a:off x="0" y="0"/>
-                      <a:ext cx="5715000" cy="3429000"/>
+                      <a:ext cx="5715000" cy="4638675"/>
                     </a:xfrm>
                     <a:prstGeom prst="rect">
                       <a:avLst/>
@@ -959,7 +1029,7 @@
         <w:spacing w:after="80"/>
       </w:pPr>
       <w:r>
-        <w:t xml:space="preserve">국문: Visium 공간 전사체 파이프라인 흐름도. 슬라이스별 불러오기·정규화(spatial_prep), 군집(spatial_cluster) 뒤 공간 가변 유전자(spatial_svf)와 슬라이스 통합 군집(spatial_merge)으로 갈라지고, 통합 군집이 조건 간 비교(spatial_condition_de)로 이어짐.</w:t>
+        <w:t xml:space="preserve">국문: Visium 공간 전사체 파이프라인 흐름도. 슬라이스별 불러오기·정규화(spatial_prep), 군집(spatial_cluster) 뒤 공간 가변 유전자(spatial_svf), 슬라이스 통합 군집(spatial_merge), 단일세포 참조를 쓰는 세포 유형 분석(spatial_labelTransfer, spatial_rctd)으로 갈라지고, 통합 군집이 조건 간 비교(spatial_condition_de)로 이어짐. 세포 유형 분석은 참조를 줄 때만 실행됨.</w:t>
       </w:r>
     </w:p>
     <w:p>
@@ -972,7 +1042,7 @@
         <w:spacing w:after="80"/>
       </w:pPr>
       <w:r>
-        <w:t xml:space="preserve">English: Visium spatial transcriptomics workflow: per-slice loading and normalisation (spatial_prep) and clustering (spatial_cluster), then spatially variable genes (spatial_svf) and joint clustering of slices (spatial_merge), followed by condition comparison (spatial_condition_de).</w:t>
+        <w:t xml:space="preserve">English: Visium spatial transcriptomics workflow: per-slice loading and normalisation (spatial_prep) and clustering (spatial_cluster), then spatially variable genes (spatial_svf), joint clustering of slices (spatial_merge) followed by condition comparison (spatial_condition_de), and cell-type analysis with a single-cell reference (spatial_labelTransfer, spatial_rctd), which runs only when a reference is given.</w:t>
       </w:r>
     </w:p>
     <w:p>
@@ -1411,6 +1481,26 @@
           <w:b/>
           <w:bCs/>
         </w:rPr>
+        <w:t xml:space="preserve">세포 유형은 같은 종, 같은 조직의 단일세포 참조 자료(Seurat RDS)로 붙입니다.</w:t>
+      </w:r>
+      <w:r>
+        <w:t xml:space="preserve"> 참조(reference_rds)와 세포 유형 열 이름(reference_label_col)을 주면 spatial_labelTransfer(세포 유형 예측 점수)와 spatial_rctd(spot 안의 세포 유형 비율)가 실행됩니다. 참조를 주지 않으면 두 모듈은 건너뛰고 나머지 분석은 그대로 끝나며, 군집은 마커 유전자와 조직 위치로 해석합니다. 공개 단일세포 아틀라스(예: CELLxGENE, Allen Brain Cell Atlas)를 참조로 쓸 수 있습니다. 열 이름을 모르면 비워 두고 실행하면 분석 전에 멈추고 오류 로그에 후보 열을 보여 줍니다.</w:t>
+      </w:r>
+    </w:p>
+    <w:p>
+      <w:pPr>
+        <w:pStyle w:val="ListParagraph"/>
+        <w:numPr>
+          <w:ilvl w:val="0"/>
+          <w:numId w:val="3"/>
+        </w:numPr>
+        <w:spacing w:after="100"/>
+      </w:pPr>
+      <w:r>
+        <w:rPr>
+          <w:b/>
+          <w:bCs/>
+        </w:rPr>
         <w:t xml:space="preserve">모든 분석은 인터넷 연결 없이 수행됩니다.</w:t>
       </w:r>
     </w:p>
@@ -1571,6 +1661,26 @@
       </w:r>
       <w:r>
         <w:t xml:space="preserve"> 32 GB is recommended for 4 slices and 64 GB for 8 or more.</w:t>
+      </w:r>
+    </w:p>
+    <w:p>
+      <w:pPr>
+        <w:pStyle w:val="ListParagraph"/>
+        <w:numPr>
+          <w:ilvl w:val="0"/>
+          <w:numId w:val="4"/>
+        </w:numPr>
+        <w:spacing w:after="100"/>
+      </w:pPr>
+      <w:r>
+        <w:rPr>
+          <w:b/>
+          <w:bCs/>
+        </w:rPr>
+        <w:t xml:space="preserve">Cell types come from a single-cell reference (Seurat RDS) of the same species and tissue.</w:t>
+      </w:r>
+      <w:r>
+        <w:t xml:space="preserve"> Given a reference (reference_rds) and its cell-type column (reference_label_col), spatial_labelTransfer (cell-type prediction scores) and spatial_rctd (cell-type proportions within spots) run. Without a reference both are skipped and the rest of the analysis finishes as usual; clusters are then interpreted by their marker genes and tissue location. Public single-cell atlases (for example CELLxGENE, Allen Brain Cell Atlas) can serve as references. If the column name is unknown, leave it empty: the run stops before the analysis and the error log lists the candidate columns.</w:t>
       </w:r>
     </w:p>
     <w:p>
@@ -1770,7 +1880,7 @@
                 <w:sz w:val="18"/>
                 <w:szCs w:val="18"/>
               </w:rPr>
-              <w:t xml:space="preserve">spatial_hd_prep, spatial_hd_cluster, spatial_condition_de</w:t>
+              <w:t xml:space="preserve">spatial_hd_prep, spatial_hd_cluster, spatial_hd_svf, spatial_condition_de(군집 기준), spatial_hd_rctd, spatial_condition_de(세포 유형 기준) (마지막 2개는 참조를 줄 때 실행)</w:t>
             </w:r>
           </w:p>
         </w:tc>
@@ -1792,7 +1902,7 @@
                 <w:sz w:val="18"/>
                 <w:szCs w:val="18"/>
               </w:rPr>
-              <w:t xml:space="preserve">Version</w:t>
+              <w:t xml:space="preserve">파이프라인 입력</w:t>
             </w:r>
           </w:p>
         </w:tc>
@@ -1812,7 +1922,35 @@
                 <w:sz w:val="18"/>
                 <w:szCs w:val="18"/>
               </w:rPr>
-              <w:t xml:space="preserve">1.0 (CLOSHA 3.0 첫 배포)</w:t>
+              <w:t xml:space="preserve">Space Ranger HD 슬라이드 폴더(필수), 슬라이드 정보 CSV(필수), 단일세포 참조 RDS </w:t>
+            </w:r>
+            <w:r>
+              <w:rPr>
+                <w:sz w:val="18"/>
+                <w:szCs w:val="18"/>
+              </w:rPr>
+              <w:t xml:space="preserve">reference_rds</w:t>
+            </w:r>
+            <w:r>
+              <w:rPr>
+                <w:sz w:val="18"/>
+                <w:szCs w:val="18"/>
+              </w:rPr>
+              <w:t xml:space="preserve">와 세포 유형 열 </w:t>
+            </w:r>
+            <w:r>
+              <w:rPr>
+                <w:sz w:val="18"/>
+                <w:szCs w:val="18"/>
+              </w:rPr>
+              <w:t xml:space="preserve">reference_label_col</w:t>
+            </w:r>
+            <w:r>
+              <w:rPr>
+                <w:sz w:val="18"/>
+                <w:szCs w:val="18"/>
+              </w:rPr>
+              <w:t xml:space="preserve">(선택)</w:t>
             </w:r>
           </w:p>
         </w:tc>
@@ -1834,7 +1972,7 @@
                 <w:sz w:val="18"/>
                 <w:szCs w:val="18"/>
               </w:rPr>
-              <w:t xml:space="preserve">Reference</w:t>
+              <w:t xml:space="preserve">Version</w:t>
             </w:r>
           </w:p>
         </w:tc>
@@ -1854,7 +1992,7 @@
                 <w:sz w:val="18"/>
                 <w:szCs w:val="18"/>
               </w:rPr>
-              <w:t xml:space="preserve">https://satijalab.org/seurat/articles/visiumhd_analysis_vignette</w:t>
+              <w:t xml:space="preserve">1.0 (CLOSHA 3.0 첫 배포)</w:t>
             </w:r>
           </w:p>
         </w:tc>
@@ -1876,7 +2014,7 @@
                 <w:sz w:val="18"/>
                 <w:szCs w:val="18"/>
               </w:rPr>
-              <w:t xml:space="preserve">Keyword(태그)</w:t>
+              <w:t xml:space="preserve">Reference</w:t>
             </w:r>
           </w:p>
         </w:tc>
@@ -1896,7 +2034,7 @@
                 <w:sz w:val="18"/>
                 <w:szCs w:val="18"/>
               </w:rPr>
-              <w:t xml:space="preserve">spatial transcriptomics, Visium HD, high-resolution spatial, clustering, sketch, differential expression</w:t>
+              <w:t xml:space="preserve">https://satijalab.org/seurat/articles/visiumhd_analysis_vignette</w:t>
             </w:r>
           </w:p>
         </w:tc>
@@ -1918,7 +2056,7 @@
                 <w:sz w:val="18"/>
                 <w:szCs w:val="18"/>
               </w:rPr>
-              <w:t xml:space="preserve">대분류 / 중분류</w:t>
+              <w:t xml:space="preserve">Keyword(태그)</w:t>
             </w:r>
           </w:p>
         </w:tc>
@@ -1938,7 +2076,7 @@
                 <w:sz w:val="18"/>
                 <w:szCs w:val="18"/>
               </w:rPr>
-              <w:t xml:space="preserve">등록 메모: 포탈 파이프라인 목록에서 가장 가까운 것을 고릅니다(후보: Transcriptomics / Spatial transcriptomics).</w:t>
+              <w:t xml:space="preserve">spatial transcriptomics, Visium HD, high-resolution spatial, clustering, sketch, spatially variable genes, differential expression</w:t>
             </w:r>
           </w:p>
         </w:tc>
@@ -1960,7 +2098,7 @@
                 <w:sz w:val="18"/>
                 <w:szCs w:val="18"/>
               </w:rPr>
-              <w:t xml:space="preserve">대표 이미지</w:t>
+              <w:t xml:space="preserve">대분류 / 중분류</w:t>
             </w:r>
           </w:p>
         </w:tc>
@@ -1980,6 +2118,48 @@
                 <w:sz w:val="18"/>
                 <w:szCs w:val="18"/>
               </w:rPr>
+              <w:t xml:space="preserve">등록 메모: 포탈 파이프라인 목록에서 가장 가까운 것을 고릅니다(후보: Transcriptomics / Spatial transcriptomics).</w:t>
+            </w:r>
+          </w:p>
+        </w:tc>
+      </w:tr>
+      <w:tr>
+        <w:tc>
+          <w:tcPr>
+            <w:tcW w:type="dxa" w:w="4753"/>
+            <w:tcMar>
+              <w:top w:type="dxa" w:w="60"/>
+              <w:left w:type="dxa" w:w="90"/>
+              <w:bottom w:type="dxa" w:w="60"/>
+              <w:right w:type="dxa" w:w="90"/>
+            </w:tcMar>
+          </w:tcPr>
+          <w:p>
+            <w:r>
+              <w:rPr>
+                <w:sz w:val="18"/>
+                <w:szCs w:val="18"/>
+              </w:rPr>
+              <w:t xml:space="preserve">대표 이미지</w:t>
+            </w:r>
+          </w:p>
+        </w:tc>
+        <w:tc>
+          <w:tcPr>
+            <w:tcW w:type="dxa" w:w="4753"/>
+            <w:tcMar>
+              <w:top w:type="dxa" w:w="60"/>
+              <w:left w:type="dxa" w:w="90"/>
+              <w:bottom w:type="dxa" w:w="60"/>
+              <w:right w:type="dxa" w:w="90"/>
+            </w:tcMar>
+          </w:tcPr>
+          <w:p>
+            <w:r>
+              <w:rPr>
+                <w:sz w:val="18"/>
+                <w:szCs w:val="18"/>
+              </w:rPr>
               <w:t xml:space="preserve">등록 메모: 결과 그림을 본 뒤 고릅니다(후보: spatial_hd_cluster 조직 위 군집).</w:t>
             </w:r>
           </w:p>
@@ -2026,7 +2206,7 @@
         <w:spacing w:after="140"/>
       </w:pPr>
       <w:r>
-        <w:t xml:space="preserve">Visium HD 공간 전사체 파이프라인은 10x Genomics Visium HD의 세포 크기에 가까운 bin(8·16µm) 단위 발현을 분석하여, 조직 안의 영역 구성과 조건에 따른 변화를 높은 해상도로 확인하는 분석 도구입니다. 슬라이드별 Space Ranger binned_outputs와 슬라이드 정보를 입력하면, bin을 거르고 정규화한 뒤 정보가 많은 bin을 뽑은 sketch로 모든 슬라이드를 함께 군집하고, 그 군집을 모든 bin에 옮겨 붙입니다. 이어서 조건 사이에서 군집 조성과 군집별 발현을 슬라이드 단위 pseudobulk DESeq2로 비교합니다. bin이 수십만 개라도 메모리에 맞게 처리하도록 sketch와 슬라이드별 처리를 씁니다.</w:t>
+        <w:t xml:space="preserve">Visium HD 공간 전사체 파이프라인은 10x Genomics Visium HD의 세포 크기에 가까운 bin(8·16µm) 단위 발현을 분석하여, 조직 안의 영역 구성과 조건에 따른 변화를 높은 해상도로 확인하는 분석 도구입니다. 슬라이드별 Space Ranger binned_outputs와 슬라이드 정보를 입력하면, bin을 거르고 정규화한 뒤 정보가 많은 bin을 뽑은 sketch로 모든 슬라이드를 함께 군집하고, 그 군집을 모든 bin에 옮겨 붙입니다. 슬라이드마다 공간 가변 유전자를 Moran's I로 찾고, 조건 사이에서 군집 조성과 군집별 발현을 슬라이드 단위 pseudobulk DESeq2로 비교합니다. bin이 수십만 개라도 메모리에 맞게 처리하도록 sketch와 슬라이드별 처리를 씁니다.</w:t>
       </w:r>
     </w:p>
     <w:p>
@@ -2049,7 +2229,7 @@
         <w:spacing w:after="140"/>
       </w:pPr>
       <w:r>
-        <w:t xml:space="preserve">The Visium HD spatial transcriptomics pipeline analyses expression in near-cellular bins (8 or 16 um) from 10x Genomics Visium HD to reveal tissue regions and their changes between conditions at high resolution. From the Space Ranger binned_outputs of each slide and a slide sheet, it filters and normalises the bins, clusters all slides together on a sketch of informative bins, and transfers the clusters to every bin. Cluster composition and per-cluster expression are then compared between conditions with slide-level pseudobulk DESeq2. Sketching and slide-by-slide processing keep hundreds of thousands of bins within memory.</w:t>
+        <w:t xml:space="preserve">The Visium HD spatial transcriptomics pipeline analyses expression in near-cellular bins (8 or 16 um) from 10x Genomics Visium HD to reveal tissue regions and their changes between conditions at high resolution. From the Space Ranger binned_outputs of each slide and a slide sheet, it filters and normalises the bins, clusters all slides together on a sketch of informative bins, and transfers the clusters to every bin. Spatially variable genes are found per slide with Moran's I, and cluster composition and per-cluster expression are compared between conditions with slide-level pseudobulk DESeq2. Sketching and slide-by-slide processing keep hundreds of thousands of bins within memory.</w:t>
       </w:r>
     </w:p>
     <w:p>
@@ -2095,7 +2275,7 @@
           <w:b/>
           <w:bCs/>
         </w:rPr>
-        <w:t xml:space="preserve">Visium HD 공간 전사체 분석으로 확인할 수 있는 세 가지 분석 목표</w:t>
+        <w:t xml:space="preserve">Visium HD 공간 전사체 분석으로 확인할 수 있는 네 가지 분석 목표</w:t>
       </w:r>
     </w:p>
     <w:p>
@@ -2147,7 +2327,27 @@
           <w:b/>
           <w:bCs/>
         </w:rPr>
-        <w:t xml:space="preserve">03 조건에 따라 영역 구성과 영역 안 발현이 어떻게 달라지는가</w:t>
+        <w:t xml:space="preserve">03 어떤 유전자가 공간적으로 몰려 발현하는가</w:t>
+      </w:r>
+    </w:p>
+    <w:p>
+      <w:pPr>
+        <w:spacing w:after="140"/>
+      </w:pPr>
+      <w:r>
+        <w:t xml:space="preserve">군집과 상관없이 조직의 특정 위치에 몰려 발현하는 유전자(공간 가변 유전자)를 Moran's I로 찾습니다. bin이 많아 슬라이드마다 무작위 bin 표본으로 계산합니다.</w:t>
+      </w:r>
+    </w:p>
+    <w:p>
+      <w:pPr>
+        <w:spacing w:after="140"/>
+      </w:pPr>
+      <w:r>
+        <w:rPr>
+          <w:b/>
+          <w:bCs/>
+        </w:rPr>
+        <w:t xml:space="preserve">04 조건에 따라 영역 구성과 영역 안 발현이 어떻게 달라지는가</w:t>
       </w:r>
     </w:p>
     <w:p>
@@ -2182,7 +2382,7 @@
           <w:b/>
           <w:bCs/>
         </w:rPr>
-        <w:t xml:space="preserve">Three questions Visium HD spatial transcriptomics analysis can answer</w:t>
+        <w:t xml:space="preserve">Four questions Visium HD spatial transcriptomics analysis can answer</w:t>
       </w:r>
     </w:p>
     <w:p>
@@ -2234,7 +2434,27 @@
           <w:b/>
           <w:bCs/>
         </w:rPr>
-        <w:t xml:space="preserve">03 How do region composition and expression within regions change between conditions?</w:t>
+        <w:t xml:space="preserve">03 Which genes are expressed in spatial patterns?</w:t>
+      </w:r>
+    </w:p>
+    <w:p>
+      <w:pPr>
+        <w:spacing w:after="140"/>
+      </w:pPr>
+      <w:r>
+        <w:t xml:space="preserve">Genes concentrated in particular places of the tissue, regardless of clusters (spatially variable genes), are found with Moran's I, computed on a random sample of bins per slide because slides have many bins.</w:t>
+      </w:r>
+    </w:p>
+    <w:p>
+      <w:pPr>
+        <w:spacing w:after="140"/>
+      </w:pPr>
+      <w:r>
+        <w:rPr>
+          <w:b/>
+          <w:bCs/>
+        </w:rPr>
+        <w:t xml:space="preserve">04 How do region composition and expression within regions change between conditions?</w:t>
       </w:r>
     </w:p>
     <w:p>
@@ -2327,7 +2547,7 @@
       <w:r>
         <w:drawing>
           <wp:inline distT="0" distB="0" distL="0" distR="0">
-            <wp:extent cx="5715000" cy="2695575"/>
+            <wp:extent cx="5715000" cy="4572000"/>
             <wp:effectExtent t="0" r="0" b="0" l="0"/>
             <wp:docPr id="3" name="" descr="" title=""/>
             <wp:cNvGraphicFramePr>
@@ -2352,7 +2572,7 @@
                   <pic:spPr bwMode="auto">
                     <a:xfrm>
                       <a:off x="0" y="0"/>
-                      <a:ext cx="5715000" cy="2695575"/>
+                      <a:ext cx="5715000" cy="4572000"/>
                     </a:xfrm>
                     <a:prstGeom prst="rect">
                       <a:avLst/>
@@ -2390,7 +2610,7 @@
         <w:spacing w:after="80"/>
       </w:pPr>
       <w:r>
-        <w:t xml:space="preserve">국문: Visium HD 공간 전사체 파이프라인 흐름도. bin 불러오기·정규화·sketch(spatial_hd_prep), 슬라이드 통합 군집과 모든 bin 배정(spatial_hd_cluster), 조건 간 비교(spatial_condition_de)로 이어짐.</w:t>
+        <w:t xml:space="preserve">국문: Visium HD 공간 전사체 파이프라인 흐름도. bin 불러오기·정규화·sketch(spatial_hd_prep), 슬라이드 통합 군집과 모든 bin 배정(spatial_hd_cluster) 뒤 조건 간 비교(spatial_condition_de), 공간 가변 유전자(spatial_hd_svf), 단일세포 참조로 모든 bin에 세포 유형을 붙이는 분석(spatial_hd_rctd)으로 갈라지고, 세포 유형 결과가 세포 유형별 조건 간 비교(spatial_condition_de)로 이어짐. 세포 유형 분석은 참조를 줄 때만 실행됨.</w:t>
       </w:r>
     </w:p>
     <w:p>
@@ -2403,7 +2623,7 @@
         <w:spacing w:after="80"/>
       </w:pPr>
       <w:r>
-        <w:t xml:space="preserve">English: Visium HD spatial transcriptomics workflow: bin loading, normalisation and sketching (spatial_hd_prep), joint clustering of slides with labels for every bin (spatial_hd_cluster), and condition comparison (spatial_condition_de).</w:t>
+        <w:t xml:space="preserve">English: Visium HD spatial transcriptomics workflow: bin loading, normalisation and sketching (spatial_hd_prep), joint clustering of slides with labels for every bin (spatial_hd_cluster), then condition comparison (spatial_condition_de), spatially variable genes (spatial_hd_svf), and cell types for every bin from a single-cell reference (spatial_hd_rctd) followed by condition comparison per cell type (spatial_condition_de); the cell-type branch runs only when a reference is given.</w:t>
       </w:r>
     </w:p>
     <w:p>
@@ -2842,6 +3062,32 @@
           <w:b/>
           <w:bCs/>
         </w:rPr>
+        <w:t xml:space="preserve">세포 유형은 같은 종, 같은 조직의 단일세포 참조 자료(Seurat RDS)로 붙입니다.</w:t>
+      </w:r>
+      <w:r>
+        <w:t xml:space="preserve"> 참조(reference_rds)와 세포 유형 열 이름(reference_label_col)을 주면 spatial_hd_rctd가 모든 bin에 세포 유형을 붙이고, 그 결과로 spatial_condition_de가 세포 유형별로(</w:t>
+      </w:r>
+      <w:r>
+        <w:t xml:space="preserve">group_by=rctd_first_type</w:t>
+      </w:r>
+      <w:r>
+        <w:t xml:space="preserve">) 조건을 비교합니다. 참조를 주지 않으면 이 두 단계는 건너뛰고 나머지 분석은 그대로 끝나며, 군집은 마커 유전자와 조직 위치로 해석합니다. 공개 단일세포 아틀라스(예: CELLxGENE, Allen Brain Cell Atlas)를 참조로 쓸 수 있습니다. 열 이름을 모르면 비워 두고 실행하면 분석 전에 멈추고 오류 로그에 후보 열을 보여 줍니다.</w:t>
+      </w:r>
+    </w:p>
+    <w:p>
+      <w:pPr>
+        <w:pStyle w:val="ListParagraph"/>
+        <w:numPr>
+          <w:ilvl w:val="0"/>
+          <w:numId w:val="5"/>
+        </w:numPr>
+        <w:spacing w:after="100"/>
+      </w:pPr>
+      <w:r>
+        <w:rPr>
+          <w:b/>
+          <w:bCs/>
+        </w:rPr>
         <w:t xml:space="preserve">모든 분석은 인터넷 연결 없이 수행됩니다.</w:t>
       </w:r>
     </w:p>
@@ -3002,6 +3248,32 @@
       </w:r>
       <w:r>
         <w:t xml:space="preserve">.</w:t>
+      </w:r>
+    </w:p>
+    <w:p>
+      <w:pPr>
+        <w:pStyle w:val="ListParagraph"/>
+        <w:numPr>
+          <w:ilvl w:val="0"/>
+          <w:numId w:val="6"/>
+        </w:numPr>
+        <w:spacing w:after="100"/>
+      </w:pPr>
+      <w:r>
+        <w:rPr>
+          <w:b/>
+          <w:bCs/>
+        </w:rPr>
+        <w:t xml:space="preserve">Cell types come from a single-cell reference (Seurat RDS) of the same species and tissue.</w:t>
+      </w:r>
+      <w:r>
+        <w:t xml:space="preserve"> Given a reference (reference_rds) and its cell-type column (reference_label_col), spatial_hd_rctd gives every bin a cell type and spatial_condition_de then compares conditions per cell type (</w:t>
+      </w:r>
+      <w:r>
+        <w:t xml:space="preserve">group_by=rctd_first_type</w:t>
+      </w:r>
+      <w:r>
+        <w:t xml:space="preserve">). Without a reference these two steps are skipped and the rest of the analysis finishes as usual; clusters are then interpreted by their marker genes and tissue location. Public single-cell atlases (for example CELLxGENE, Allen Brain Cell Atlas) can serve as references. If the column name is unknown, leave it empty: the run stops before the analysis and the error log lists the candidate columns.</w:t>
       </w:r>
     </w:p>
     <w:p>

</xml_diff>

<commit_message>
Spatial: generous cores and memory (8 cores; 128 GB for labelTransfer, hd_cluster, hd_rctd)
Co-Authored-By: Claude Opus 5.5 <noreply@anthropic.com>
</commit_message>
<xml_diff>
--- a/docs/Spatial_Transcriptomics_Analysis_Pipeline/pipeline/Portal_Content.docx
+++ b/docs/Spatial_Transcriptomics_Analysis_Pipeline/pipeline/Portal_Content.docx
@@ -1464,7 +1464,7 @@
         <w:t xml:space="preserve">슬라이스가 많을수록 통합 단계의 메모리가 늘어납니다.</w:t>
       </w:r>
       <w:r>
-        <w:t xml:space="preserve"> 슬라이스 4장은 32GB, 8장 이상은 64GB를 권장합니다.</w:t>
+        <w:t xml:space="preserve"> 통합 단계(spatial_merge)는 64GB를 권장하며, 슬라이스가 아주 많으면 128GB로 올려 주세요. 단일세포 참조가 크면(수만 세포 이상) spatial_labelTransfer에 128GB를 권장합니다.</w:t>
       </w:r>
     </w:p>
     <w:p>
@@ -1660,7 +1660,7 @@
         <w:t xml:space="preserve">Memory of the integration step grows with the number of slices.</w:t>
       </w:r>
       <w:r>
-        <w:t xml:space="preserve"> 32 GB is recommended for 4 slices and 64 GB for 8 or more.</w:t>
+        <w:t xml:space="preserve"> 64 GB is recommended for the integration step (spatial_merge), and 128 GB for very many slices. With a large single-cell reference (tens of thousands of cells or more), 128 GB is recommended for spatial_labelTransfer.</w:t>
       </w:r>
     </w:p>
     <w:p>
@@ -3039,7 +3039,7 @@
         <w:t xml:space="preserve">메모리를 많이 씁니다.</w:t>
       </w:r>
       <w:r>
-        <w:t xml:space="preserve"> 8µm는 슬라이드당 32~64GB, 여러 장의 통합 군집은 64~128GB를 권장합니다. 메모리가 부족하면 bin 크기 16µm를 쓰거나 </w:t>
+        <w:t xml:space="preserve"> spatial_hd_prep과 spatial_hd_svf는 64GB, 통합 군집(spatial_hd_cluster)과 세포 유형(spatial_hd_rctd)은 128GB를 권장합니다. 메모리가 부족하면 bin 크기 16µm를 쓰거나 </w:t>
       </w:r>
       <w:r>
         <w:t xml:space="preserve">min_counts</w:t>
@@ -3241,7 +3241,7 @@
         <w:t xml:space="preserve">Memory use is high.</w:t>
       </w:r>
       <w:r>
-        <w:t xml:space="preserve"> 32-64 GB per slide is recommended for 8 um, and 64-128 GB for joint clustering of several slides. When memory runs out, use 16 um bins or a higher </w:t>
+        <w:t xml:space="preserve"> 64 GB is recommended for spatial_hd_prep and spatial_hd_svf, and 128 GB for joint clustering (spatial_hd_cluster) and cell types (spatial_hd_rctd). When memory runs out, use 16 um bins or a higher </w:t>
       </w:r>
       <w:r>
         <w:t xml:space="preserve">min_counts</w:t>

</xml_diff>

<commit_message>
Spatial content: cell-type step in the concept figure, goal 05, subtitles
- Concept figure: panel D (cell types from a single-cell reference:
  proportions per Visium spot, one type per HD bin; skipped without a
  reference). Legends and alt texts updated.
- Pipelines: subtitles (Visium 공간 발현 영역 분석 / Visium HD 고해상도
  공간 분석), intros and keywords mention the cell-type step, goal 05
  added, region examples follow the new examples (heart, colorectal).
- Modules: subtitles within 10-20 characters (labelTransfer, rctd,
  hd_rctd shortened; svf lengthened).

Co-Authored-By: Claude Opus 5.5 <noreply@anthropic.com>
</commit_message>
<xml_diff>
--- a/docs/Spatial_Transcriptomics_Analysis_Pipeline/pipeline/Portal_Content.docx
+++ b/docs/Spatial_Transcriptomics_Analysis_Pipeline/pipeline/Portal_Content.docx
@@ -279,27 +279,27 @@
                 <w:sz w:val="18"/>
                 <w:szCs w:val="18"/>
               </w:rPr>
-              <w:t xml:space="preserve">구성 모듈</w:t>
-            </w:r>
-          </w:p>
-        </w:tc>
-        <w:tc>
-          <w:tcPr>
-            <w:tcW w:type="dxa" w:w="4753"/>
-            <w:tcMar>
-              <w:top w:type="dxa" w:w="60"/>
-              <w:left w:type="dxa" w:w="90"/>
-              <w:bottom w:type="dxa" w:w="60"/>
-              <w:right w:type="dxa" w:w="90"/>
-            </w:tcMar>
-          </w:tcPr>
-          <w:p>
-            <w:r>
-              <w:rPr>
-                <w:sz w:val="18"/>
-                <w:szCs w:val="18"/>
-              </w:rPr>
-              <w:t xml:space="preserve">spatial_prep, spatial_cluster, spatial_svf, spatial_merge, spatial_condition_de, spatial_labelTransfer, spatial_rctd (세포 유형 2개는 참조를 줄 때 실행)</w:t>
+              <w:t xml:space="preserve">서브 타이틀(국문)</w:t>
+            </w:r>
+          </w:p>
+        </w:tc>
+        <w:tc>
+          <w:tcPr>
+            <w:tcW w:type="dxa" w:w="4753"/>
+            <w:tcMar>
+              <w:top w:type="dxa" w:w="60"/>
+              <w:left w:type="dxa" w:w="90"/>
+              <w:bottom w:type="dxa" w:w="60"/>
+              <w:right w:type="dxa" w:w="90"/>
+            </w:tcMar>
+          </w:tcPr>
+          <w:p>
+            <w:r>
+              <w:rPr>
+                <w:sz w:val="18"/>
+                <w:szCs w:val="18"/>
+              </w:rPr>
+              <w:t xml:space="preserve">Visium 공간 발현 영역 분석</w:t>
             </w:r>
           </w:p>
         </w:tc>
@@ -321,55 +321,27 @@
                 <w:sz w:val="18"/>
                 <w:szCs w:val="18"/>
               </w:rPr>
-              <w:t xml:space="preserve">파이프라인 입력</w:t>
-            </w:r>
-          </w:p>
-        </w:tc>
-        <w:tc>
-          <w:tcPr>
-            <w:tcW w:type="dxa" w:w="4753"/>
-            <w:tcMar>
-              <w:top w:type="dxa" w:w="60"/>
-              <w:left w:type="dxa" w:w="90"/>
-              <w:bottom w:type="dxa" w:w="60"/>
-              <w:right w:type="dxa" w:w="90"/>
-            </w:tcMar>
-          </w:tcPr>
-          <w:p>
-            <w:r>
-              <w:rPr>
-                <w:sz w:val="18"/>
-                <w:szCs w:val="18"/>
-              </w:rPr>
-              <w:t xml:space="preserve">Space Ranger 슬라이스 폴더(필수), 슬라이스 정보 CSV(필수), 단일세포 참조 RDS </w:t>
-            </w:r>
-            <w:r>
-              <w:rPr>
-                <w:sz w:val="18"/>
-                <w:szCs w:val="18"/>
-              </w:rPr>
-              <w:t xml:space="preserve">reference_rds</w:t>
-            </w:r>
-            <w:r>
-              <w:rPr>
-                <w:sz w:val="18"/>
-                <w:szCs w:val="18"/>
-              </w:rPr>
-              <w:t xml:space="preserve">와 세포 유형 열 </w:t>
-            </w:r>
-            <w:r>
-              <w:rPr>
-                <w:sz w:val="18"/>
-                <w:szCs w:val="18"/>
-              </w:rPr>
-              <w:t xml:space="preserve">reference_label_col</w:t>
-            </w:r>
-            <w:r>
-              <w:rPr>
-                <w:sz w:val="18"/>
-                <w:szCs w:val="18"/>
-              </w:rPr>
-              <w:t xml:space="preserve">(선택)</w:t>
+              <w:t xml:space="preserve">서브 타이틀(영문)</w:t>
+            </w:r>
+          </w:p>
+        </w:tc>
+        <w:tc>
+          <w:tcPr>
+            <w:tcW w:type="dxa" w:w="4753"/>
+            <w:tcMar>
+              <w:top w:type="dxa" w:w="60"/>
+              <w:left w:type="dxa" w:w="90"/>
+              <w:bottom w:type="dxa" w:w="60"/>
+              <w:right w:type="dxa" w:w="90"/>
+            </w:tcMar>
+          </w:tcPr>
+          <w:p>
+            <w:r>
+              <w:rPr>
+                <w:sz w:val="18"/>
+                <w:szCs w:val="18"/>
+              </w:rPr>
+              <w:t xml:space="preserve">Spatial expression regions with Visium</w:t>
             </w:r>
           </w:p>
         </w:tc>
@@ -391,27 +363,27 @@
                 <w:sz w:val="18"/>
                 <w:szCs w:val="18"/>
               </w:rPr>
-              <w:t xml:space="preserve">Version</w:t>
-            </w:r>
-          </w:p>
-        </w:tc>
-        <w:tc>
-          <w:tcPr>
-            <w:tcW w:type="dxa" w:w="4753"/>
-            <w:tcMar>
-              <w:top w:type="dxa" w:w="60"/>
-              <w:left w:type="dxa" w:w="90"/>
-              <w:bottom w:type="dxa" w:w="60"/>
-              <w:right w:type="dxa" w:w="90"/>
-            </w:tcMar>
-          </w:tcPr>
-          <w:p>
-            <w:r>
-              <w:rPr>
-                <w:sz w:val="18"/>
-                <w:szCs w:val="18"/>
-              </w:rPr>
-              <w:t xml:space="preserve">1.1 (CLOSHA 2.0 파이프라인 버전 + 1. 등록 메모: 2.0 파이프라인 버전이 1.0이라는 전제이며, 다르면 그 번호 + 1로 고칩니다)</w:t>
+              <w:t xml:space="preserve">구성 모듈</w:t>
+            </w:r>
+          </w:p>
+        </w:tc>
+        <w:tc>
+          <w:tcPr>
+            <w:tcW w:type="dxa" w:w="4753"/>
+            <w:tcMar>
+              <w:top w:type="dxa" w:w="60"/>
+              <w:left w:type="dxa" w:w="90"/>
+              <w:bottom w:type="dxa" w:w="60"/>
+              <w:right w:type="dxa" w:w="90"/>
+            </w:tcMar>
+          </w:tcPr>
+          <w:p>
+            <w:r>
+              <w:rPr>
+                <w:sz w:val="18"/>
+                <w:szCs w:val="18"/>
+              </w:rPr>
+              <w:t xml:space="preserve">spatial_prep, spatial_cluster, spatial_svf, spatial_merge, spatial_condition_de, spatial_labelTransfer, spatial_rctd (세포 유형 2개는 참조를 줄 때 실행)</w:t>
             </w:r>
           </w:p>
         </w:tc>
@@ -433,27 +405,55 @@
                 <w:sz w:val="18"/>
                 <w:szCs w:val="18"/>
               </w:rPr>
-              <w:t xml:space="preserve">Reference</w:t>
-            </w:r>
-          </w:p>
-        </w:tc>
-        <w:tc>
-          <w:tcPr>
-            <w:tcW w:type="dxa" w:w="4753"/>
-            <w:tcMar>
-              <w:top w:type="dxa" w:w="60"/>
-              <w:left w:type="dxa" w:w="90"/>
-              <w:bottom w:type="dxa" w:w="60"/>
-              <w:right w:type="dxa" w:w="90"/>
-            </w:tcMar>
-          </w:tcPr>
-          <w:p>
-            <w:r>
-              <w:rPr>
-                <w:sz w:val="18"/>
-                <w:szCs w:val="18"/>
-              </w:rPr>
-              <w:t xml:space="preserve">https://satijalab.org/seurat/articles/spatial_vignette</w:t>
+              <w:t xml:space="preserve">파이프라인 입력</w:t>
+            </w:r>
+          </w:p>
+        </w:tc>
+        <w:tc>
+          <w:tcPr>
+            <w:tcW w:type="dxa" w:w="4753"/>
+            <w:tcMar>
+              <w:top w:type="dxa" w:w="60"/>
+              <w:left w:type="dxa" w:w="90"/>
+              <w:bottom w:type="dxa" w:w="60"/>
+              <w:right w:type="dxa" w:w="90"/>
+            </w:tcMar>
+          </w:tcPr>
+          <w:p>
+            <w:r>
+              <w:rPr>
+                <w:sz w:val="18"/>
+                <w:szCs w:val="18"/>
+              </w:rPr>
+              <w:t xml:space="preserve">Space Ranger 슬라이스 폴더(필수), 슬라이스 정보 CSV(필수), 단일세포 참조 RDS </w:t>
+            </w:r>
+            <w:r>
+              <w:rPr>
+                <w:sz w:val="18"/>
+                <w:szCs w:val="18"/>
+              </w:rPr>
+              <w:t xml:space="preserve">reference_rds</w:t>
+            </w:r>
+            <w:r>
+              <w:rPr>
+                <w:sz w:val="18"/>
+                <w:szCs w:val="18"/>
+              </w:rPr>
+              <w:t xml:space="preserve">와 세포 유형 열 </w:t>
+            </w:r>
+            <w:r>
+              <w:rPr>
+                <w:sz w:val="18"/>
+                <w:szCs w:val="18"/>
+              </w:rPr>
+              <w:t xml:space="preserve">reference_label_col</w:t>
+            </w:r>
+            <w:r>
+              <w:rPr>
+                <w:sz w:val="18"/>
+                <w:szCs w:val="18"/>
+              </w:rPr>
+              <w:t xml:space="preserve">(선택)</w:t>
             </w:r>
           </w:p>
         </w:tc>
@@ -475,6 +475,90 @@
                 <w:sz w:val="18"/>
                 <w:szCs w:val="18"/>
               </w:rPr>
+              <w:t xml:space="preserve">Version</w:t>
+            </w:r>
+          </w:p>
+        </w:tc>
+        <w:tc>
+          <w:tcPr>
+            <w:tcW w:type="dxa" w:w="4753"/>
+            <w:tcMar>
+              <w:top w:type="dxa" w:w="60"/>
+              <w:left w:type="dxa" w:w="90"/>
+              <w:bottom w:type="dxa" w:w="60"/>
+              <w:right w:type="dxa" w:w="90"/>
+            </w:tcMar>
+          </w:tcPr>
+          <w:p>
+            <w:r>
+              <w:rPr>
+                <w:sz w:val="18"/>
+                <w:szCs w:val="18"/>
+              </w:rPr>
+              <w:t xml:space="preserve">1.1 (CLOSHA 2.0 파이프라인 버전 + 1. 등록 메모: 2.0 파이프라인 버전이 1.0이라는 전제이며, 다르면 그 번호 + 1로 고칩니다)</w:t>
+            </w:r>
+          </w:p>
+        </w:tc>
+      </w:tr>
+      <w:tr>
+        <w:tc>
+          <w:tcPr>
+            <w:tcW w:type="dxa" w:w="4753"/>
+            <w:tcMar>
+              <w:top w:type="dxa" w:w="60"/>
+              <w:left w:type="dxa" w:w="90"/>
+              <w:bottom w:type="dxa" w:w="60"/>
+              <w:right w:type="dxa" w:w="90"/>
+            </w:tcMar>
+          </w:tcPr>
+          <w:p>
+            <w:r>
+              <w:rPr>
+                <w:sz w:val="18"/>
+                <w:szCs w:val="18"/>
+              </w:rPr>
+              <w:t xml:space="preserve">Reference</w:t>
+            </w:r>
+          </w:p>
+        </w:tc>
+        <w:tc>
+          <w:tcPr>
+            <w:tcW w:type="dxa" w:w="4753"/>
+            <w:tcMar>
+              <w:top w:type="dxa" w:w="60"/>
+              <w:left w:type="dxa" w:w="90"/>
+              <w:bottom w:type="dxa" w:w="60"/>
+              <w:right w:type="dxa" w:w="90"/>
+            </w:tcMar>
+          </w:tcPr>
+          <w:p>
+            <w:r>
+              <w:rPr>
+                <w:sz w:val="18"/>
+                <w:szCs w:val="18"/>
+              </w:rPr>
+              <w:t xml:space="preserve">https://satijalab.org/seurat/articles/spatial_vignette</w:t>
+            </w:r>
+          </w:p>
+        </w:tc>
+      </w:tr>
+      <w:tr>
+        <w:tc>
+          <w:tcPr>
+            <w:tcW w:type="dxa" w:w="4753"/>
+            <w:tcMar>
+              <w:top w:type="dxa" w:w="60"/>
+              <w:left w:type="dxa" w:w="90"/>
+              <w:bottom w:type="dxa" w:w="60"/>
+              <w:right w:type="dxa" w:w="90"/>
+            </w:tcMar>
+          </w:tcPr>
+          <w:p>
+            <w:r>
+              <w:rPr>
+                <w:sz w:val="18"/>
+                <w:szCs w:val="18"/>
+              </w:rPr>
               <w:t xml:space="preserve">Keyword(태그)</w:t>
             </w:r>
           </w:p>
@@ -495,7 +579,7 @@
                 <w:sz w:val="18"/>
                 <w:szCs w:val="18"/>
               </w:rPr>
-              <w:t xml:space="preserve">spatial transcriptomics, Visium, clustering, spatially variable genes, multi-slice integration, differential expression</w:t>
+              <w:t xml:space="preserve">spatial transcriptomics, Visium, clustering, spatially variable genes, multi-slice integration, differential expression, cell type deconvolution, label transfer</w:t>
             </w:r>
           </w:p>
         </w:tc>
@@ -625,7 +709,7 @@
         <w:spacing w:after="140"/>
       </w:pPr>
       <w:r>
-        <w:t xml:space="preserve">Visium 공간 전사체 파이프라인은 10x Genomics Visium으로 얻은 조직 절편의 spot별 유전자 발현을 분석하여, 조직 안의 영역 구성과 공간적인 발현 패턴, 조건에 따른 변화를 확인하는 분석 도구입니다. 슬라이스별 Space Ranger 결과와 슬라이스 정보를 입력하면, Seurat으로 spot을 거르고 SCTransform으로 정규화한 뒤, 슬라이스별 군집과 마커, 공간 가변 유전자를 찾고, 여러 슬라이스를 합쳐(Harmony 선택) 같은 기준의 군집을 만들고, 조건 사이에서 군집 조성과 군집별 발현을 pseudobulk DESeq2로 비교합니다.</w:t>
+        <w:t xml:space="preserve">Visium 공간 전사체 파이프라인은 10x Genomics Visium으로 얻은 조직 절편의 spot별 유전자 발현을 분석하여, 조직 안의 영역 구성과 공간적인 발현 패턴, 조건에 따른 변화를 확인하는 분석 도구입니다. 슬라이스별 Space Ranger 결과와 슬라이스 정보를 입력하면, Seurat으로 spot을 거르고 SCTransform으로 정규화한 뒤, 슬라이스별 군집과 마커, 공간 가변 유전자를 찾고, 여러 슬라이스를 합쳐(Harmony 선택) 같은 기준의 군집을 만들고, 조건 사이에서 군집 조성과 군집별 발현을 pseudobulk DESeq2로 비교합니다. 같은 조직의 단일세포 참조 자료를 함께 주면 spot마다 세포 유형 예측 점수(Seurat label transfer)와 세포 유형 비율(RCTD)도 계산합니다.</w:t>
       </w:r>
     </w:p>
     <w:p>
@@ -648,7 +732,7 @@
         <w:spacing w:after="140"/>
       </w:pPr>
       <w:r>
-        <w:t xml:space="preserve">The Visium spatial transcriptomics pipeline analyses per-spot gene expression of tissue sections from 10x Genomics Visium to reveal how the tissue is organised into regions, which genes follow spatial patterns, and what changes between conditions. From the Space Ranger output of each slice and a slice sheet, it filters spots and normalises them with SCTransform in Seurat, finds clusters, markers and spatially variable genes per slice, merges the slices (optionally with Harmony) into common clusters, and compares cluster composition and per-cluster expression between conditions with pseudobulk DESeq2.</w:t>
+        <w:t xml:space="preserve">The Visium spatial transcriptomics pipeline analyses per-spot gene expression of tissue sections from 10x Genomics Visium to reveal how the tissue is organised into regions, which genes follow spatial patterns, and what changes between conditions. From the Space Ranger output of each slice and a slice sheet, it filters spots and normalises them with SCTransform in Seurat, finds clusters, markers and spatially variable genes per slice, merges the slices (optionally with Harmony) into common clusters, and compares cluster composition and per-cluster expression between conditions with pseudobulk DESeq2. Given a single-cell reference of the same tissue, it also computes cell-type prediction scores (Seurat label transfer) and cell-type proportions (RCTD) for every spot.</w:t>
       </w:r>
     </w:p>
     <w:p>
@@ -694,7 +778,7 @@
           <w:b/>
           <w:bCs/>
         </w:rPr>
-        <w:t xml:space="preserve">Visium 공간 전사체 분석으로 확인할 수 있는 네 가지 분석 목표</w:t>
+        <w:t xml:space="preserve">Visium 공간 전사체 분석으로 확인할 수 있는 다섯 가지 분석 목표</w:t>
       </w:r>
     </w:p>
     <w:p>
@@ -714,7 +798,7 @@
         <w:spacing w:after="140"/>
       </w:pPr>
       <w:r>
-        <w:t xml:space="preserve">spot을 발현이 비슷한 군집으로 나누고 조직 위에 그려, 피질 층이나 해마처럼 해부학적 영역과 그 경계를 확인합니다.</w:t>
+        <w:t xml:space="preserve">spot을 발현이 비슷한 군집으로 나누고 조직 위에 그려, 심근, 섬유화 부위, 혈관 주변처럼 조직 영역과 그 경계를 확인합니다.</w:t>
       </w:r>
     </w:p>
     <w:p>
@@ -775,6 +859,26 @@
       </w:pPr>
       <w:r>
         <w:t xml:space="preserve">여러 슬라이스를 같은 기준으로 군집한 뒤, 조건 사이에서 군집 비율과 군집별 유전자 발현을 비교합니다. 조건마다 슬라이스가 2장 이상이면 통계 검정을 합니다.</w:t>
+      </w:r>
+    </w:p>
+    <w:p>
+      <w:pPr>
+        <w:spacing w:after="140"/>
+      </w:pPr>
+      <w:r>
+        <w:rPr>
+          <w:b/>
+          <w:bCs/>
+        </w:rPr>
+        <w:t xml:space="preserve">05 각 위치에는 어떤 세포가 있는가</w:t>
+      </w:r>
+    </w:p>
+    <w:p>
+      <w:pPr>
+        <w:spacing w:after="140"/>
+      </w:pPr>
+      <w:r>
+        <w:t xml:space="preserve">같은 조직의 단일세포 참조 자료가 있으면, spot마다 세포 유형 예측 점수와 spot 안의 세포 유형 비율을 계산합니다. spot 하나에 세포가 여러 개 들어 있어 비율로 봅니다. 참조가 없으면 이 단계는 건너뛰고 군집 마커로 해석합니다.</w:t>
       </w:r>
     </w:p>
     <w:p>
@@ -801,7 +905,7 @@
           <w:b/>
           <w:bCs/>
         </w:rPr>
-        <w:t xml:space="preserve">Four questions Visium spatial transcriptomics analysis can answer</w:t>
+        <w:t xml:space="preserve">Five questions Visium spatial transcriptomics analysis can answer</w:t>
       </w:r>
     </w:p>
     <w:p>
@@ -821,7 +925,7 @@
         <w:spacing w:after="140"/>
       </w:pPr>
       <w:r>
-        <w:t xml:space="preserve">Spots are clustered by similar expression and drawn on the tissue, revealing anatomical regions such as cortical layers and the hippocampus and their borders.</w:t>
+        <w:t xml:space="preserve">Spots are clustered by similar expression and drawn on the tissue, revealing tissue regions such as myocardium, fibrotic areas and perivascular zones and their borders.</w:t>
       </w:r>
     </w:p>
     <w:p>
@@ -882,6 +986,26 @@
       </w:pPr>
       <w:r>
         <w:t xml:space="preserve">After all slices are clustered on a common basis, cluster proportions and per-cluster gene expression are compared between conditions, with statistical testing when each condition has two or more slices.</w:t>
+      </w:r>
+    </w:p>
+    <w:p>
+      <w:pPr>
+        <w:spacing w:after="140"/>
+      </w:pPr>
+      <w:r>
+        <w:rPr>
+          <w:b/>
+          <w:bCs/>
+        </w:rPr>
+        <w:t xml:space="preserve">05 Which cells are at each position?</w:t>
+      </w:r>
+    </w:p>
+    <w:p>
+      <w:pPr>
+        <w:spacing w:after="140"/>
+      </w:pPr>
+      <w:r>
+        <w:t xml:space="preserve">With a single-cell reference of the same tissue, cell-type prediction scores and cell-type proportions within each spot are computed; a spot holds several cells, so types are read as proportions. Without a reference this step is skipped and clusters are read through their marker genes.</w:t>
       </w:r>
     </w:p>
     <w:p>
@@ -1127,7 +1251,7 @@
       <w:r>
         <w:drawing>
           <wp:inline distT="0" distB="0" distL="0" distR="0">
-            <wp:extent cx="5715000" cy="2790825"/>
+            <wp:extent cx="5715000" cy="3876675"/>
             <wp:effectExtent t="0" r="0" b="0" l="0"/>
             <wp:docPr id="2" name="" descr="" title=""/>
             <wp:cNvGraphicFramePr>
@@ -1152,7 +1276,7 @@
                   <pic:spPr bwMode="auto">
                     <a:xfrm>
                       <a:off x="0" y="0"/>
-                      <a:ext cx="5715000" cy="2790825"/>
+                      <a:ext cx="5715000" cy="3876675"/>
                     </a:xfrm>
                     <a:prstGeom prst="rect">
                       <a:avLst/>
@@ -1192,7 +1316,7 @@
         <w:t xml:space="preserve">그림. 공간 전사체 분석의 원리.</w:t>
       </w:r>
       <w:r>
-        <w:t xml:space="preserve"> (A) 조직 절편 위의 격자에서 위치마다 유전자 발현을 셉니다. Visium은 지름 55µm spot(spot마다 세포 1~10개)이고, Visium HD는 2µm 사각형을 8µm 또는 16µm bin으로 묶어 세포 크기에 가까운 해상도로 봅니다. 이 파이프라인은 Visium spot을 분석합니다. (B) 발현이 비슷한 spot을 군집으로 묶어 조직 위에 칠하면 층 구조나 핵 같은 조직 영역이 드러나고, UMAP에서는 군집이 서로 떨어진 점 무리로 보입니다. (C) 조건 비교는 같은 군집(같은 영역) 안에서 합니다. 슬라이스마다 그 군집 spot의 count를 합친 pseudobulk를 만들고, 슬라이스를 반복으로 삼아 DESeq2로 조건 간 차이를 검정합니다. 조건마다 슬라이스가 한 장뿐이면 spot 단위 검정만 할 수 있으며 탐색용입니다. 조직 모양, 군집, count 값은 모식적인 값입니다.</w:t>
+        <w:t xml:space="preserve"> (A) 조직 절편 위의 격자에서 위치마다 유전자 발현을 셉니다. Visium은 지름 55µm spot(spot마다 세포 1~10개)이고, Visium HD는 2µm 사각형을 8µm 또는 16µm bin으로 묶어 세포 크기에 가까운 해상도로 봅니다. 이 파이프라인은 Visium spot을 분석합니다. (B) 발현이 비슷한 spot을 군집으로 묶어 조직 위에 칠하면 층 구조나 핵 같은 조직 영역이 드러나고, UMAP에서는 군집이 서로 떨어진 점 무리로 보입니다. (C) 조건 비교는 같은 군집(같은 영역) 안에서 합니다. 슬라이스마다 그 군집 spot의 count를 합친 pseudobulk를 만들고, 슬라이스를 반복으로 삼아 DESeq2로 조건 간 차이를 검정합니다. 조건마다 슬라이스가 한 장뿐이면 spot 단위 검정만 할 수 있으며 탐색용입니다. (D) 같은 조직의 단일세포 참조 자료가 있으면, 참조의 세포 유형별 발현 특징으로 위치마다 세포 유형을 추정합니다. Visium spot은 세포가 섞여 있어 비율로, Visium HD bin은 세포 하나 크기라 유형으로 붙이고, 그 결과로 세포 유형별 조건 비교도 할 수 있습니다. 참조가 없으면 이 단계는 건너뜁니다. 조직 모양, 군집, count 값은 모식적인 값입니다.</w:t>
       </w:r>
     </w:p>
     <w:p>
@@ -1222,7 +1346,7 @@
         <w:t xml:space="preserve">Figure. Principle of spatial transcriptomics analysis.</w:t>
       </w:r>
       <w:r>
-        <w:t xml:space="preserve"> (A) Gene expression is counted at each position of a grid over the tissue section: Visium uses 55 um spots (1-10 cells each), and Visium HD groups 2 um squares into 8 or 16 um bins, close to cellular resolution. This pipeline analyses Visium spots. (B) Spots with similar expression are grouped into clusters; painted on the tissue they reveal regions such as layers and nuclei, and in the UMAP they form separate groups of points. (C) Conditions are compared within one cluster (one region). For each slice the counts of that cluster's spots are summed into a pseudobulk sample, and DESeq2 tests the condition with slices as replicates. With one slice per condition only a spot-level test is possible, which is exploratory. Tissue shape, clusters and counts are schematic.</w:t>
+        <w:t xml:space="preserve"> (A) Gene expression is counted at each position of a grid over the tissue section: Visium uses 55 um spots (1-10 cells each), and Visium HD groups 2 um squares into 8 or 16 um bins, close to cellular resolution. This pipeline analyses Visium spots. (B) Spots with similar expression are grouped into clusters; painted on the tissue they reveal regions such as layers and nuclei, and in the UMAP they form separate groups of points. (C) Conditions are compared within one cluster (one region). For each slice the counts of that cluster's spots are summed into a pseudobulk sample, and DESeq2 tests the condition with slices as replicates. With one slice per condition only a spot-level test is possible, which is exploratory. (D) With a single-cell reference of the same tissue, cell types are estimated at each position from the reference's per-type expression profiles: as proportions in Visium spots, which hold several cells, and as one type per Visium HD bin, which is about one cell; conditions can then also be compared per cell type. Without a reference this step is skipped. Tissue shape, clusters and counts are schematic.</w:t>
       </w:r>
     </w:p>
     <w:p>
@@ -1250,7 +1374,7 @@
         <w:spacing w:after="80"/>
       </w:pPr>
       <w:r>
-        <w:t xml:space="preserve">국문: 공간 전사체 개념도. 조직 위 Visium spot과 Visium HD bin 격자, 조직 영역을 나타내는 군집과 UMAP, 슬라이스별 pseudobulk count를 DESeq2로 비교하는 과정을 보여 줌.</w:t>
+        <w:t xml:space="preserve">국문: 공간 전사체 개념도. 조직 위 Visium spot과 Visium HD bin 격자, 조직 영역을 나타내는 군집과 UMAP, 슬라이스별 pseudobulk count를 DESeq2로 비교하는 과정, 단일세포 참조로 spot의 세포 유형 비율과 bin의 세포 유형을 붙이는 과정을 보여 줌.</w:t>
       </w:r>
     </w:p>
     <w:p>
@@ -1263,7 +1387,7 @@
         <w:spacing w:after="80"/>
       </w:pPr>
       <w:r>
-        <w:t xml:space="preserve">English: Concept of spatial transcriptomics: Visium spots and Visium HD bins on a tissue, clusters as tissue regions with a UMAP, and slice-level pseudobulk counts compared with DESeq2.</w:t>
+        <w:t xml:space="preserve">English: Concept of spatial transcriptomics: Visium spots and Visium HD bins on a tissue, clusters as tissue regions with a UMAP, slice-level pseudobulk counts compared with DESeq2, and cell types assigned from a single-cell reference as proportions per spot and one type per bin.</w:t>
       </w:r>
     </w:p>
     <w:p>
@@ -1860,27 +1984,27 @@
                 <w:sz w:val="18"/>
                 <w:szCs w:val="18"/>
               </w:rPr>
-              <w:t xml:space="preserve">구성 모듈</w:t>
-            </w:r>
-          </w:p>
-        </w:tc>
-        <w:tc>
-          <w:tcPr>
-            <w:tcW w:type="dxa" w:w="4753"/>
-            <w:tcMar>
-              <w:top w:type="dxa" w:w="60"/>
-              <w:left w:type="dxa" w:w="90"/>
-              <w:bottom w:type="dxa" w:w="60"/>
-              <w:right w:type="dxa" w:w="90"/>
-            </w:tcMar>
-          </w:tcPr>
-          <w:p>
-            <w:r>
-              <w:rPr>
-                <w:sz w:val="18"/>
-                <w:szCs w:val="18"/>
-              </w:rPr>
-              <w:t xml:space="preserve">spatial_hd_prep, spatial_hd_cluster, spatial_hd_svf, spatial_condition_de(군집 기준), spatial_hd_rctd, spatial_condition_de(세포 유형 기준) (마지막 2개는 참조를 줄 때 실행)</w:t>
+              <w:t xml:space="preserve">서브 타이틀(국문)</w:t>
+            </w:r>
+          </w:p>
+        </w:tc>
+        <w:tc>
+          <w:tcPr>
+            <w:tcW w:type="dxa" w:w="4753"/>
+            <w:tcMar>
+              <w:top w:type="dxa" w:w="60"/>
+              <w:left w:type="dxa" w:w="90"/>
+              <w:bottom w:type="dxa" w:w="60"/>
+              <w:right w:type="dxa" w:w="90"/>
+            </w:tcMar>
+          </w:tcPr>
+          <w:p>
+            <w:r>
+              <w:rPr>
+                <w:sz w:val="18"/>
+                <w:szCs w:val="18"/>
+              </w:rPr>
+              <w:t xml:space="preserve">Visium HD 고해상도 공간 분석</w:t>
             </w:r>
           </w:p>
         </w:tc>
@@ -1902,55 +2026,27 @@
                 <w:sz w:val="18"/>
                 <w:szCs w:val="18"/>
               </w:rPr>
-              <w:t xml:space="preserve">파이프라인 입력</w:t>
-            </w:r>
-          </w:p>
-        </w:tc>
-        <w:tc>
-          <w:tcPr>
-            <w:tcW w:type="dxa" w:w="4753"/>
-            <w:tcMar>
-              <w:top w:type="dxa" w:w="60"/>
-              <w:left w:type="dxa" w:w="90"/>
-              <w:bottom w:type="dxa" w:w="60"/>
-              <w:right w:type="dxa" w:w="90"/>
-            </w:tcMar>
-          </w:tcPr>
-          <w:p>
-            <w:r>
-              <w:rPr>
-                <w:sz w:val="18"/>
-                <w:szCs w:val="18"/>
-              </w:rPr>
-              <w:t xml:space="preserve">Space Ranger HD 슬라이드 폴더(필수), 슬라이드 정보 CSV(필수), 단일세포 참조 RDS </w:t>
-            </w:r>
-            <w:r>
-              <w:rPr>
-                <w:sz w:val="18"/>
-                <w:szCs w:val="18"/>
-              </w:rPr>
-              <w:t xml:space="preserve">reference_rds</w:t>
-            </w:r>
-            <w:r>
-              <w:rPr>
-                <w:sz w:val="18"/>
-                <w:szCs w:val="18"/>
-              </w:rPr>
-              <w:t xml:space="preserve">와 세포 유형 열 </w:t>
-            </w:r>
-            <w:r>
-              <w:rPr>
-                <w:sz w:val="18"/>
-                <w:szCs w:val="18"/>
-              </w:rPr>
-              <w:t xml:space="preserve">reference_label_col</w:t>
-            </w:r>
-            <w:r>
-              <w:rPr>
-                <w:sz w:val="18"/>
-                <w:szCs w:val="18"/>
-              </w:rPr>
-              <w:t xml:space="preserve">(선택)</w:t>
+              <w:t xml:space="preserve">서브 타이틀(영문)</w:t>
+            </w:r>
+          </w:p>
+        </w:tc>
+        <w:tc>
+          <w:tcPr>
+            <w:tcW w:type="dxa" w:w="4753"/>
+            <w:tcMar>
+              <w:top w:type="dxa" w:w="60"/>
+              <w:left w:type="dxa" w:w="90"/>
+              <w:bottom w:type="dxa" w:w="60"/>
+              <w:right w:type="dxa" w:w="90"/>
+            </w:tcMar>
+          </w:tcPr>
+          <w:p>
+            <w:r>
+              <w:rPr>
+                <w:sz w:val="18"/>
+                <w:szCs w:val="18"/>
+              </w:rPr>
+              <w:t xml:space="preserve">High-resolution spatial analysis with Visium HD</w:t>
             </w:r>
           </w:p>
         </w:tc>
@@ -1972,27 +2068,27 @@
                 <w:sz w:val="18"/>
                 <w:szCs w:val="18"/>
               </w:rPr>
-              <w:t xml:space="preserve">Version</w:t>
-            </w:r>
-          </w:p>
-        </w:tc>
-        <w:tc>
-          <w:tcPr>
-            <w:tcW w:type="dxa" w:w="4753"/>
-            <w:tcMar>
-              <w:top w:type="dxa" w:w="60"/>
-              <w:left w:type="dxa" w:w="90"/>
-              <w:bottom w:type="dxa" w:w="60"/>
-              <w:right w:type="dxa" w:w="90"/>
-            </w:tcMar>
-          </w:tcPr>
-          <w:p>
-            <w:r>
-              <w:rPr>
-                <w:sz w:val="18"/>
-                <w:szCs w:val="18"/>
-              </w:rPr>
-              <w:t xml:space="preserve">1.0 (CLOSHA 3.0 첫 배포)</w:t>
+              <w:t xml:space="preserve">구성 모듈</w:t>
+            </w:r>
+          </w:p>
+        </w:tc>
+        <w:tc>
+          <w:tcPr>
+            <w:tcW w:type="dxa" w:w="4753"/>
+            <w:tcMar>
+              <w:top w:type="dxa" w:w="60"/>
+              <w:left w:type="dxa" w:w="90"/>
+              <w:bottom w:type="dxa" w:w="60"/>
+              <w:right w:type="dxa" w:w="90"/>
+            </w:tcMar>
+          </w:tcPr>
+          <w:p>
+            <w:r>
+              <w:rPr>
+                <w:sz w:val="18"/>
+                <w:szCs w:val="18"/>
+              </w:rPr>
+              <w:t xml:space="preserve">spatial_hd_prep, spatial_hd_cluster, spatial_hd_svf, spatial_condition_de(군집 기준), spatial_hd_rctd, spatial_condition_de(세포 유형 기준) (마지막 2개는 참조를 줄 때 실행)</w:t>
             </w:r>
           </w:p>
         </w:tc>
@@ -2014,27 +2110,55 @@
                 <w:sz w:val="18"/>
                 <w:szCs w:val="18"/>
               </w:rPr>
-              <w:t xml:space="preserve">Reference</w:t>
-            </w:r>
-          </w:p>
-        </w:tc>
-        <w:tc>
-          <w:tcPr>
-            <w:tcW w:type="dxa" w:w="4753"/>
-            <w:tcMar>
-              <w:top w:type="dxa" w:w="60"/>
-              <w:left w:type="dxa" w:w="90"/>
-              <w:bottom w:type="dxa" w:w="60"/>
-              <w:right w:type="dxa" w:w="90"/>
-            </w:tcMar>
-          </w:tcPr>
-          <w:p>
-            <w:r>
-              <w:rPr>
-                <w:sz w:val="18"/>
-                <w:szCs w:val="18"/>
-              </w:rPr>
-              <w:t xml:space="preserve">https://satijalab.org/seurat/articles/visiumhd_analysis_vignette</w:t>
+              <w:t xml:space="preserve">파이프라인 입력</w:t>
+            </w:r>
+          </w:p>
+        </w:tc>
+        <w:tc>
+          <w:tcPr>
+            <w:tcW w:type="dxa" w:w="4753"/>
+            <w:tcMar>
+              <w:top w:type="dxa" w:w="60"/>
+              <w:left w:type="dxa" w:w="90"/>
+              <w:bottom w:type="dxa" w:w="60"/>
+              <w:right w:type="dxa" w:w="90"/>
+            </w:tcMar>
+          </w:tcPr>
+          <w:p>
+            <w:r>
+              <w:rPr>
+                <w:sz w:val="18"/>
+                <w:szCs w:val="18"/>
+              </w:rPr>
+              <w:t xml:space="preserve">Space Ranger HD 슬라이드 폴더(필수), 슬라이드 정보 CSV(필수), 단일세포 참조 RDS </w:t>
+            </w:r>
+            <w:r>
+              <w:rPr>
+                <w:sz w:val="18"/>
+                <w:szCs w:val="18"/>
+              </w:rPr>
+              <w:t xml:space="preserve">reference_rds</w:t>
+            </w:r>
+            <w:r>
+              <w:rPr>
+                <w:sz w:val="18"/>
+                <w:szCs w:val="18"/>
+              </w:rPr>
+              <w:t xml:space="preserve">와 세포 유형 열 </w:t>
+            </w:r>
+            <w:r>
+              <w:rPr>
+                <w:sz w:val="18"/>
+                <w:szCs w:val="18"/>
+              </w:rPr>
+              <w:t xml:space="preserve">reference_label_col</w:t>
+            </w:r>
+            <w:r>
+              <w:rPr>
+                <w:sz w:val="18"/>
+                <w:szCs w:val="18"/>
+              </w:rPr>
+              <w:t xml:space="preserve">(선택)</w:t>
             </w:r>
           </w:p>
         </w:tc>
@@ -2056,6 +2180,90 @@
                 <w:sz w:val="18"/>
                 <w:szCs w:val="18"/>
               </w:rPr>
+              <w:t xml:space="preserve">Version</w:t>
+            </w:r>
+          </w:p>
+        </w:tc>
+        <w:tc>
+          <w:tcPr>
+            <w:tcW w:type="dxa" w:w="4753"/>
+            <w:tcMar>
+              <w:top w:type="dxa" w:w="60"/>
+              <w:left w:type="dxa" w:w="90"/>
+              <w:bottom w:type="dxa" w:w="60"/>
+              <w:right w:type="dxa" w:w="90"/>
+            </w:tcMar>
+          </w:tcPr>
+          <w:p>
+            <w:r>
+              <w:rPr>
+                <w:sz w:val="18"/>
+                <w:szCs w:val="18"/>
+              </w:rPr>
+              <w:t xml:space="preserve">1.0 (CLOSHA 3.0 첫 배포)</w:t>
+            </w:r>
+          </w:p>
+        </w:tc>
+      </w:tr>
+      <w:tr>
+        <w:tc>
+          <w:tcPr>
+            <w:tcW w:type="dxa" w:w="4753"/>
+            <w:tcMar>
+              <w:top w:type="dxa" w:w="60"/>
+              <w:left w:type="dxa" w:w="90"/>
+              <w:bottom w:type="dxa" w:w="60"/>
+              <w:right w:type="dxa" w:w="90"/>
+            </w:tcMar>
+          </w:tcPr>
+          <w:p>
+            <w:r>
+              <w:rPr>
+                <w:sz w:val="18"/>
+                <w:szCs w:val="18"/>
+              </w:rPr>
+              <w:t xml:space="preserve">Reference</w:t>
+            </w:r>
+          </w:p>
+        </w:tc>
+        <w:tc>
+          <w:tcPr>
+            <w:tcW w:type="dxa" w:w="4753"/>
+            <w:tcMar>
+              <w:top w:type="dxa" w:w="60"/>
+              <w:left w:type="dxa" w:w="90"/>
+              <w:bottom w:type="dxa" w:w="60"/>
+              <w:right w:type="dxa" w:w="90"/>
+            </w:tcMar>
+          </w:tcPr>
+          <w:p>
+            <w:r>
+              <w:rPr>
+                <w:sz w:val="18"/>
+                <w:szCs w:val="18"/>
+              </w:rPr>
+              <w:t xml:space="preserve">https://satijalab.org/seurat/articles/visiumhd_analysis_vignette</w:t>
+            </w:r>
+          </w:p>
+        </w:tc>
+      </w:tr>
+      <w:tr>
+        <w:tc>
+          <w:tcPr>
+            <w:tcW w:type="dxa" w:w="4753"/>
+            <w:tcMar>
+              <w:top w:type="dxa" w:w="60"/>
+              <w:left w:type="dxa" w:w="90"/>
+              <w:bottom w:type="dxa" w:w="60"/>
+              <w:right w:type="dxa" w:w="90"/>
+            </w:tcMar>
+          </w:tcPr>
+          <w:p>
+            <w:r>
+              <w:rPr>
+                <w:sz w:val="18"/>
+                <w:szCs w:val="18"/>
+              </w:rPr>
               <w:t xml:space="preserve">Keyword(태그)</w:t>
             </w:r>
           </w:p>
@@ -2076,7 +2284,7 @@
                 <w:sz w:val="18"/>
                 <w:szCs w:val="18"/>
               </w:rPr>
-              <w:t xml:space="preserve">spatial transcriptomics, Visium HD, high-resolution spatial, clustering, sketch, spatially variable genes, differential expression</w:t>
+              <w:t xml:space="preserve">spatial transcriptomics, Visium HD, high-resolution spatial, clustering, sketch, spatially variable genes, differential expression, cell type annotation, RCTD</w:t>
             </w:r>
           </w:p>
         </w:tc>
@@ -2206,7 +2414,7 @@
         <w:spacing w:after="140"/>
       </w:pPr>
       <w:r>
-        <w:t xml:space="preserve">Visium HD 공간 전사체 파이프라인은 10x Genomics Visium HD의 세포 크기에 가까운 bin(8·16µm) 단위 발현을 분석하여, 조직 안의 영역 구성과 조건에 따른 변화를 높은 해상도로 확인하는 분석 도구입니다. 슬라이드별 Space Ranger binned_outputs와 슬라이드 정보를 입력하면, bin을 거르고 정규화한 뒤 정보가 많은 bin을 뽑은 sketch로 모든 슬라이드를 함께 군집하고, 그 군집을 모든 bin에 옮겨 붙입니다. 슬라이드마다 공간 가변 유전자를 Moran's I로 찾고, 조건 사이에서 군집 조성과 군집별 발현을 슬라이드 단위 pseudobulk DESeq2로 비교합니다. bin이 수십만 개라도 메모리에 맞게 처리하도록 sketch와 슬라이드별 처리를 씁니다.</w:t>
+        <w:t xml:space="preserve">Visium HD 공간 전사체 파이프라인은 10x Genomics Visium HD의 세포 크기에 가까운 bin(8·16µm) 단위 발현을 분석하여, 조직 안의 영역 구성과 조건에 따른 변화를 높은 해상도로 확인하는 분석 도구입니다. 슬라이드별 Space Ranger binned_outputs와 슬라이드 정보를 입력하면, bin을 거르고 정규화한 뒤 정보가 많은 bin을 뽑은 sketch로 모든 슬라이드를 함께 군집하고, 그 군집을 모든 bin에 옮겨 붙입니다. 슬라이드마다 공간 가변 유전자를 Moran's I로 찾고, 조건 사이에서 군집 조성과 군집별 발현을 슬라이드 단위 pseudobulk DESeq2로 비교합니다. 같은 조직의 단일세포 참조 자료를 함께 주면 모든 bin에 세포 유형을 붙이고(RCTD), 세포 유형별로도 조건을 비교합니다. bin이 수십만 개라도 메모리에 맞게 처리하도록 sketch와 슬라이드별 처리를 씁니다.</w:t>
       </w:r>
     </w:p>
     <w:p>
@@ -2229,7 +2437,7 @@
         <w:spacing w:after="140"/>
       </w:pPr>
       <w:r>
-        <w:t xml:space="preserve">The Visium HD spatial transcriptomics pipeline analyses expression in near-cellular bins (8 or 16 um) from 10x Genomics Visium HD to reveal tissue regions and their changes between conditions at high resolution. From the Space Ranger binned_outputs of each slide and a slide sheet, it filters and normalises the bins, clusters all slides together on a sketch of informative bins, and transfers the clusters to every bin. Spatially variable genes are found per slide with Moran's I, and cluster composition and per-cluster expression are compared between conditions with slide-level pseudobulk DESeq2. Sketching and slide-by-slide processing keep hundreds of thousands of bins within memory.</w:t>
+        <w:t xml:space="preserve">The Visium HD spatial transcriptomics pipeline analyses expression in near-cellular bins (8 or 16 um) from 10x Genomics Visium HD to reveal tissue regions and their changes between conditions at high resolution. From the Space Ranger binned_outputs of each slide and a slide sheet, it filters and normalises the bins, clusters all slides together on a sketch of informative bins, and transfers the clusters to every bin. Spatially variable genes are found per slide with Moran's I, and cluster composition and per-cluster expression are compared between conditions with slide-level pseudobulk DESeq2. Given a single-cell reference of the same tissue, every bin also gets a cell type (RCTD) and conditions are compared per cell type. Sketching and slide-by-slide processing keep hundreds of thousands of bins within memory.</w:t>
       </w:r>
     </w:p>
     <w:p>
@@ -2275,7 +2483,7 @@
           <w:b/>
           <w:bCs/>
         </w:rPr>
-        <w:t xml:space="preserve">Visium HD 공간 전사체 분석으로 확인할 수 있는 네 가지 분석 목표</w:t>
+        <w:t xml:space="preserve">Visium HD 공간 전사체 분석으로 확인할 수 있는 다섯 가지 분석 목표</w:t>
       </w:r>
     </w:p>
     <w:p>
@@ -2295,7 +2503,7 @@
         <w:spacing w:after="140"/>
       </w:pPr>
       <w:r>
-        <w:t xml:space="preserve">bin을 발현이 비슷한 군집으로 나누고 조직 위에 그려, 피질 층이나 해마처럼 해부학적 영역과 그 경계를 세포 크기에 가까운 해상도로 확인합니다.</w:t>
+        <w:t xml:space="preserve">bin을 발현이 비슷한 군집으로 나누고 조직 위에 그려, 종양, 정상 점막, 근육층, 기질처럼 조직 영역과 그 경계를 세포 크기에 가까운 해상도로 확인합니다.</w:t>
       </w:r>
     </w:p>
     <w:p>
@@ -2356,6 +2564,26 @@
       </w:pPr>
       <w:r>
         <w:t xml:space="preserve">모든 슬라이드를 같은 기준으로 군집한 뒤, 조건 사이에서 군집 비율과 군집별 유전자 발현을 비교합니다. 조건마다 슬라이드가 2장 이상이면 통계 검정을 합니다.</w:t>
+      </w:r>
+    </w:p>
+    <w:p>
+      <w:pPr>
+        <w:spacing w:after="140"/>
+      </w:pPr>
+      <w:r>
+        <w:rPr>
+          <w:b/>
+          <w:bCs/>
+        </w:rPr>
+        <w:t xml:space="preserve">05 각 위치에는 어떤 세포가 있는가</w:t>
+      </w:r>
+    </w:p>
+    <w:p>
+      <w:pPr>
+        <w:spacing w:after="140"/>
+      </w:pPr>
+      <w:r>
+        <w:t xml:space="preserve">같은 조직의 단일세포 참조 자료가 있으면, 세포 크기에 가까운 bin마다 세포 유형을 붙이고 세포 유형별로도 조건을 비교합니다. 참조가 없으면 이 단계는 건너뛰고 군집 마커로 해석합니다.</w:t>
       </w:r>
     </w:p>
     <w:p>
@@ -2382,7 +2610,7 @@
           <w:b/>
           <w:bCs/>
         </w:rPr>
-        <w:t xml:space="preserve">Four questions Visium HD spatial transcriptomics analysis can answer</w:t>
+        <w:t xml:space="preserve">Five questions Visium HD spatial transcriptomics analysis can answer</w:t>
       </w:r>
     </w:p>
     <w:p>
@@ -2402,7 +2630,7 @@
         <w:spacing w:after="140"/>
       </w:pPr>
       <w:r>
-        <w:t xml:space="preserve">Bins are clustered by similar expression and drawn on the tissue, revealing anatomical regions such as cortical layers and the hippocampus and their borders at near-cellular resolution.</w:t>
+        <w:t xml:space="preserve">Bins are clustered by similar expression and drawn on the tissue, revealing tissue regions such as tumour, normal mucosa, muscle layers and stroma and their borders at near-cellular resolution.</w:t>
       </w:r>
     </w:p>
     <w:p>
@@ -2463,6 +2691,26 @@
       </w:pPr>
       <w:r>
         <w:t xml:space="preserve">After all slides are clustered on a common basis, cluster proportions and per-cluster gene expression are compared between conditions, with statistical testing when each condition has two or more slides.</w:t>
+      </w:r>
+    </w:p>
+    <w:p>
+      <w:pPr>
+        <w:spacing w:after="140"/>
+      </w:pPr>
+      <w:r>
+        <w:rPr>
+          <w:b/>
+          <w:bCs/>
+        </w:rPr>
+        <w:t xml:space="preserve">05 Which cells are at each position?</w:t>
+      </w:r>
+    </w:p>
+    <w:p>
+      <w:pPr>
+        <w:spacing w:after="140"/>
+      </w:pPr>
+      <w:r>
+        <w:t xml:space="preserve">With a single-cell reference of the same tissue, every near-cellular bin gets a cell type, and conditions are also compared per cell type. Without a reference this step is skipped and clusters are read through their marker genes.</w:t>
       </w:r>
     </w:p>
     <w:p>
@@ -2708,7 +2956,7 @@
       <w:r>
         <w:drawing>
           <wp:inline distT="0" distB="0" distL="0" distR="0">
-            <wp:extent cx="5715000" cy="2790825"/>
+            <wp:extent cx="5715000" cy="3876675"/>
             <wp:effectExtent t="0" r="0" b="0" l="0"/>
             <wp:docPr id="4" name="" descr="" title=""/>
             <wp:cNvGraphicFramePr>
@@ -2733,7 +2981,7 @@
                   <pic:spPr bwMode="auto">
                     <a:xfrm>
                       <a:off x="0" y="0"/>
-                      <a:ext cx="5715000" cy="2790825"/>
+                      <a:ext cx="5715000" cy="3876675"/>
                     </a:xfrm>
                     <a:prstGeom prst="rect">
                       <a:avLst/>
@@ -2773,7 +3021,7 @@
         <w:t xml:space="preserve">그림. 공간 전사체 분석의 원리.</w:t>
       </w:r>
       <w:r>
-        <w:t xml:space="preserve"> (A) 조직 절편 위의 격자에서 위치마다 유전자 발현을 셉니다. Visium은 지름 55µm spot(spot마다 세포 1~10개)이고, Visium HD는 2µm 사각형을 8µm 또는 16µm bin으로 묶어 세포 크기에 가까운 해상도로 봅니다. 이 파이프라인은 Visium HD bin을 분석합니다. (B) 발현이 비슷한 bin을 군집으로 묶어 조직 위에 칠하면 층 구조나 핵 같은 조직 영역이 드러나고, UMAP에서는 군집이 서로 떨어진 점 무리로 보입니다. (C) 조건 비교는 같은 군집(같은 영역) 안에서 합니다. 슬라이드마다 그 군집 bin의 count를 합친 pseudobulk를 만들고, 슬라이드를 반복으로 삼아 DESeq2로 조건 간 차이를 검정합니다. 조건마다 슬라이드가 한 장뿐이면 bin 단위 검정만 할 수 있으며 탐색용입니다. 조직 모양, 군집, count 값은 모식적인 값입니다.</w:t>
+        <w:t xml:space="preserve"> (A) 조직 절편 위의 격자에서 위치마다 유전자 발현을 셉니다. Visium은 지름 55µm spot(spot마다 세포 1~10개)이고, Visium HD는 2µm 사각형을 8µm 또는 16µm bin으로 묶어 세포 크기에 가까운 해상도로 봅니다. 이 파이프라인은 Visium HD bin을 분석합니다. (B) 발현이 비슷한 bin을 군집으로 묶어 조직 위에 칠하면 층 구조나 핵 같은 조직 영역이 드러나고, UMAP에서는 군집이 서로 떨어진 점 무리로 보입니다. (C) 조건 비교는 같은 군집(같은 영역) 안에서 합니다. 슬라이드마다 그 군집 bin의 count를 합친 pseudobulk를 만들고, 슬라이드를 반복으로 삼아 DESeq2로 조건 간 차이를 검정합니다. 조건마다 슬라이드가 한 장뿐이면 bin 단위 검정만 할 수 있으며 탐색용입니다. (D) 같은 조직의 단일세포 참조 자료가 있으면, 참조의 세포 유형별 발현 특징으로 위치마다 세포 유형을 추정합니다. Visium spot은 세포가 섞여 있어 비율로, Visium HD bin은 세포 하나 크기라 유형으로 붙이고, 그 결과로 세포 유형별 조건 비교도 할 수 있습니다. 참조가 없으면 이 단계는 건너뜁니다. 조직 모양, 군집, count 값은 모식적인 값입니다.</w:t>
       </w:r>
     </w:p>
     <w:p>
@@ -2803,7 +3051,7 @@
         <w:t xml:space="preserve">Figure. Principle of spatial transcriptomics analysis.</w:t>
       </w:r>
       <w:r>
-        <w:t xml:space="preserve"> (A) Gene expression is counted at each position of a grid over the tissue section: Visium uses 55 um spots (1-10 cells each), and Visium HD groups 2 um squares into 8 or 16 um bins, close to cellular resolution. This pipeline analyses Visium HD bins. (B) Bins with similar expression are grouped into clusters; painted on the tissue they reveal regions such as layers and nuclei, and in the UMAP they form separate groups of points. (C) Conditions are compared within one cluster (one region). For each slide the counts of that cluster's bins are summed into a pseudobulk sample, and DESeq2 tests the condition with slides as replicates. With one slide per condition only a bin-level test is possible, which is exploratory. Tissue shape, clusters and counts are schematic.</w:t>
+        <w:t xml:space="preserve"> (A) Gene expression is counted at each position of a grid over the tissue section: Visium uses 55 um spots (1-10 cells each), and Visium HD groups 2 um squares into 8 or 16 um bins, close to cellular resolution. This pipeline analyses Visium HD bins. (B) Bins with similar expression are grouped into clusters; painted on the tissue they reveal regions such as layers and nuclei, and in the UMAP they form separate groups of points. (C) Conditions are compared within one cluster (one region). For each slide the counts of that cluster's bins are summed into a pseudobulk sample, and DESeq2 tests the condition with slides as replicates. With one slide per condition only a bin-level test is possible, which is exploratory. (D) With a single-cell reference of the same tissue, cell types are estimated at each position from the reference's per-type expression profiles: as proportions in Visium spots, which hold several cells, and as one type per Visium HD bin, which is about one cell; conditions can then also be compared per cell type. Without a reference this step is skipped. Tissue shape, clusters and counts are schematic.</w:t>
       </w:r>
     </w:p>
     <w:p>
@@ -2831,7 +3079,7 @@
         <w:spacing w:after="80"/>
       </w:pPr>
       <w:r>
-        <w:t xml:space="preserve">국문: 공간 전사체 개념도. 조직 위 Visium spot과 Visium HD bin 격자, 조직 영역을 나타내는 군집과 UMAP, 슬라이드별 pseudobulk count를 DESeq2로 비교하는 과정을 보여 줌.</w:t>
+        <w:t xml:space="preserve">국문: 공간 전사체 개념도. 조직 위 Visium spot과 Visium HD bin 격자, 조직 영역을 나타내는 군집과 UMAP, 슬라이드별 pseudobulk count를 DESeq2로 비교하는 과정, 단일세포 참조로 spot의 세포 유형 비율과 bin의 세포 유형을 붙이는 과정을 보여 줌.</w:t>
       </w:r>
     </w:p>
     <w:p>
@@ -2844,7 +3092,7 @@
         <w:spacing w:after="80"/>
       </w:pPr>
       <w:r>
-        <w:t xml:space="preserve">English: Concept of spatial transcriptomics: Visium spots and Visium HD bins on a tissue, clusters as tissue regions with a UMAP, and slide-level pseudobulk counts compared with DESeq2.</w:t>
+        <w:t xml:space="preserve">English: Concept of spatial transcriptomics: Visium spots and Visium HD bins on a tissue, clusters as tissue regions with a UMAP, slide-level pseudobulk counts compared with DESeq2, and cell types assigned from a single-cell reference as proportions per spot and one type per bin.</w:t>
       </w:r>
     </w:p>
     <w:p>

</xml_diff>